<commit_message>
feat:Added the training progress of DETR
</commit_message>
<xml_diff>
--- a/paper_notes/DETR.docx
+++ b/paper_notes/DETR.docx
@@ -3,6 +3,11 @@
 <w:document xmlns:wpc="http://schemas.microsoft.com/office/word/2010/wordprocessingCanvas" xmlns:cx="http://schemas.microsoft.com/office/drawing/2014/chartex" xmlns:cx1="http://schemas.microsoft.com/office/drawing/2015/9/8/chartex" xmlns:cx2="http://schemas.microsoft.com/office/drawing/2015/10/21/chartex" xmlns:cx3="http://schemas.microsoft.com/office/drawing/2016/5/9/chartex" xmlns:cx4="http://schemas.microsoft.com/office/drawing/2016/5/10/chartex" xmlns:cx5="http://schemas.microsoft.com/office/drawing/2016/5/11/chartex" xmlns:cx6="http://schemas.microsoft.com/office/drawing/2016/5/12/chartex" xmlns:cx7="http://schemas.microsoft.com/office/drawing/2016/5/13/chartex" xmlns:cx8="http://schemas.microsoft.com/office/drawing/2016/5/14/chartex" xmlns:mc="http://schemas.openxmlformats.org/markup-compatibility/2006" xmlns:aink="http://schemas.microsoft.com/office/drawing/2016/ink" xmlns:am3d="http://schemas.microsoft.com/office/drawing/2017/model3d" xmlns:o="urn:schemas-microsoft-com:office:office" xmlns:oel="http://schemas.microsoft.com/office/2019/extlst" xmlns:r="http://schemas.openxmlformats.org/officeDocument/2006/relationships" xmlns:m="http://schemas.openxmlformats.org/officeDocument/2006/math" xmlns:v="urn:schemas-microsoft-com:vml" xmlns:wp14="http://schemas.microsoft.com/office/word/2010/wordprocessingDrawing" xmlns:wp="http://schemas.openxmlformats.org/drawingml/2006/wordprocessingDrawing" xmlns:w10="urn:schemas-microsoft-com:office:word" xmlns:w="http://schemas.openxmlformats.org/wordprocessingml/2006/main" xmlns:w14="http://schemas.microsoft.com/office/word/2010/wordml" xmlns:w15="http://schemas.microsoft.com/office/word/2012/wordml" xmlns:w16cex="http://schemas.microsoft.com/office/word/2018/wordml/cex" xmlns:w16cid="http://schemas.microsoft.com/office/word/2016/wordml/cid" xmlns:w16="http://schemas.microsoft.com/office/word/2018/wordml" xmlns:w16sdtdh="http://schemas.microsoft.com/office/word/2020/wordml/sdtdatahash" xmlns:w16se="http://schemas.microsoft.com/office/word/2015/wordml/symex" xmlns:wpg="http://schemas.microsoft.com/office/word/2010/wordprocessingGroup" xmlns:wpi="http://schemas.microsoft.com/office/word/2010/wordprocessingInk" xmlns:wne="http://schemas.microsoft.com/office/word/2006/wordml" xmlns:wps="http://schemas.microsoft.com/office/word/2010/wordprocessingShape" mc:Ignorable="w14 w15 w16se w16cid w16 w16cex w16sdtdh wp14">
   <w:body>
     <w:p>
+      <w:pPr>
+        <w:rPr>
+          <w:rFonts w:hint="eastAsia"/>
+        </w:rPr>
+      </w:pPr>
       <w:r>
         <w:t>输入原始图片 形状：[1, 3, 800, 800]（分别代表：</w:t>
       </w:r>
@@ -16,6 +21,11 @@
       </w:r>
     </w:p>
     <w:p>
+      <w:pPr>
+        <w:rPr>
+          <w:rFonts w:hint="eastAsia"/>
+        </w:rPr>
+      </w:pPr>
       <w:r>
         <w:t>↓ 步骤 1：送入 ResNet-50 主干网（</w:t>
       </w:r>
@@ -45,6 +55,11 @@
       </w:r>
     </w:p>
     <w:p>
+      <w:pPr>
+        <w:rPr>
+          <w:rFonts w:hint="eastAsia"/>
+        </w:rPr>
+      </w:pPr>
       <w:r>
         <w:t>↓ 步骤 2：通过 1x1 卷积层（</w:t>
       </w:r>
@@ -66,6 +81,11 @@
       </w:r>
     </w:p>
     <w:p>
+      <w:pPr>
+        <w:rPr>
+          <w:rFonts w:hint="eastAsia"/>
+        </w:rPr>
+      </w:pPr>
       <w:r>
         <w:t>↓ 步骤 3：特征</w:t>
       </w:r>
@@ -103,6 +123,11 @@
       </w:r>
     </w:p>
     <w:p>
+      <w:pPr>
+        <w:rPr>
+          <w:rFonts w:hint="eastAsia"/>
+        </w:rPr>
+      </w:pPr>
       <w:r>
         <w:t xml:space="preserve">↓ 步骤 4：构建并叠加位置编码（pos） 形状依然是：[625, 1, 256] 物理意义：利用 </w:t>
       </w:r>
@@ -124,6 +149,11 @@
       </w:r>
     </w:p>
     <w:p>
+      <w:pPr>
+        <w:rPr>
+          <w:rFonts w:hint="eastAsia"/>
+        </w:rPr>
+      </w:pPr>
       <w:r>
         <w:t>↓ 步骤 5：双管齐下轰击 Transformer（</w:t>
       </w:r>
@@ -145,6 +175,11 @@
       </w:r>
     </w:p>
     <w:p>
+      <w:pPr>
+        <w:rPr>
+          <w:rFonts w:hint="eastAsia"/>
+        </w:rPr>
+      </w:pPr>
       <w:r>
         <w:t xml:space="preserve">矩阵在内部做完交叉注意力机制后，由 100 </w:t>
       </w:r>
@@ -182,6 +217,11 @@
       </w:r>
     </w:p>
     <w:p>
+      <w:pPr>
+        <w:rPr>
+          <w:rFonts w:hint="eastAsia"/>
+        </w:rPr>
+      </w:pPr>
       <w:r>
         <w:t>↓ 步骤 6：通过分类预测头（</w:t>
       </w:r>
@@ -235,6 +275,11 @@
       </w:r>
     </w:p>
     <w:p>
+      <w:pPr>
+        <w:rPr>
+          <w:rFonts w:hint="eastAsia"/>
+        </w:rPr>
+      </w:pPr>
       <w:r>
         <w:t>↓ 步骤 7：通过坐标预测头（</w:t>
       </w:r>
@@ -280,8 +325,354 @@
       </w:r>
     </w:p>
     <w:p>
+      <w:pPr>
+        <w:rPr>
+          <w:rFonts w:hint="eastAsia"/>
+        </w:rPr>
+      </w:pPr>
       <w:r>
         <w:t>极简形状流转线： [1, 3, 800, 800] -&gt; [1, 2048, 25, 25] -&gt; [1, 256, 25, 25] -&gt; [625, 1, 256] -&gt;【Transformer 轰击，同时塞入 [100, 1, 256] 问询】-&gt; [1, 100, 256] -&gt; 最终分流为 [1, 100, 81] (查出是啥) 和 [1, 100, 4] (查出在哪)</w:t>
+      </w:r>
+    </w:p>
+    <w:p/>
+    <w:p/>
+    <w:p>
+      <w:r>
+        <w:lastRenderedPageBreak/>
+        <w:t>DETR训练流程详解</w:t>
+      </w:r>
+    </w:p>
+    <w:p>
+      <w:r>
+        <w:t>DETR训练的核心逻辑在于解决固定数量的预测输出（100个框）与动态数量的真实目标（Ground Truth）之间的端到端匹配问题。其训练流程主要分为标签对齐、匈牙利匹配、分类与定位损失计算、以及辅助损失引入四个规范步骤。</w:t>
+      </w:r>
+    </w:p>
+    <w:p>
+      <w:pPr>
+        <w:numPr>
+          <w:ilvl w:val="0"/>
+          <w:numId w:val="1"/>
+        </w:numPr>
+      </w:pPr>
+      <w:r>
+        <w:t xml:space="preserve">真实标签的处理与对齐 在单张输入图像中，假设包含 M </w:t>
+      </w:r>
+      <w:proofErr w:type="gramStart"/>
+      <w:r>
+        <w:t>个</w:t>
+      </w:r>
+      <w:proofErr w:type="gramEnd"/>
+      <w:r>
+        <w:t xml:space="preserve">真实目标。每个目标的标签由类别信息与边界框坐标组成。为了能够与网络固定的 N=100 </w:t>
+      </w:r>
+      <w:proofErr w:type="gramStart"/>
+      <w:r>
+        <w:t>个</w:t>
+      </w:r>
+      <w:proofErr w:type="gramEnd"/>
+      <w:r>
+        <w:t>预测输出进行计算和对齐，</w:t>
+      </w:r>
+      <w:proofErr w:type="gramStart"/>
+      <w:r>
+        <w:t>标签端会使用</w:t>
+      </w:r>
+      <w:proofErr w:type="gramEnd"/>
+      <w:r>
+        <w:t xml:space="preserve">特殊的空类别标记（即背景）将目标集合强制填充（Padding）至 100 </w:t>
+      </w:r>
+      <w:proofErr w:type="gramStart"/>
+      <w:r>
+        <w:t>个</w:t>
+      </w:r>
+      <w:proofErr w:type="gramEnd"/>
+      <w:r>
+        <w:t>。通过这种方式，使得预测端和标签端在数量上达到一致。</w:t>
+      </w:r>
+    </w:p>
+    <w:p>
+      <w:pPr>
+        <w:numPr>
+          <w:ilvl w:val="0"/>
+          <w:numId w:val="1"/>
+        </w:numPr>
+      </w:pPr>
+      <w:r>
+        <w:t xml:space="preserve">匈牙利匹配算法（Hungarian Match） 在计算损失函数之前，必须在 100 </w:t>
+      </w:r>
+      <w:proofErr w:type="gramStart"/>
+      <w:r>
+        <w:t>个</w:t>
+      </w:r>
+      <w:proofErr w:type="gramEnd"/>
+      <w:r>
+        <w:t xml:space="preserve">预测值与 100 </w:t>
+      </w:r>
+      <w:proofErr w:type="gramStart"/>
+      <w:r>
+        <w:t>个</w:t>
+      </w:r>
+      <w:proofErr w:type="gramEnd"/>
+      <w:r>
+        <w:t xml:space="preserve">真实标签之间建立一一对应（二分图匹配）的关系。DETR 通过引入匈牙利算法来寻找一个总代价最小的置换排列。 匹配的搜索过程通过构建一个 100×100 的代价矩阵完成。矩阵中的每个元素表示第 </w:t>
+      </w:r>
+      <w:proofErr w:type="spellStart"/>
+      <w:r>
+        <w:t>i</w:t>
+      </w:r>
+      <w:proofErr w:type="spellEnd"/>
+      <w:r>
+        <w:t xml:space="preserve"> </w:t>
+      </w:r>
+      <w:proofErr w:type="gramStart"/>
+      <w:r>
+        <w:t>个</w:t>
+      </w:r>
+      <w:proofErr w:type="gramEnd"/>
+      <w:r>
+        <w:t xml:space="preserve">预测框与第 j </w:t>
+      </w:r>
+      <w:proofErr w:type="gramStart"/>
+      <w:r>
+        <w:t>个</w:t>
+      </w:r>
+      <w:proofErr w:type="gramEnd"/>
+      <w:r>
+        <w:t xml:space="preserve">真实标签的匹配代价。该代价由分类代价和定位代价共同决定：分类代价取决于预测概率分布在真实类别上的接近程度；定位代价则由预测框与真实框之间的 L1 损失与 </w:t>
+      </w:r>
+      <w:proofErr w:type="spellStart"/>
+      <w:r>
+        <w:t>GIoU</w:t>
+      </w:r>
+      <w:proofErr w:type="spellEnd"/>
+      <w:r>
+        <w:t xml:space="preserve"> 损失共同决定。 需要注意的是，对于填充的背景标签，其定位代价和分类代价不计入匹配搜索过程，专门由真实的 M </w:t>
+      </w:r>
+      <w:proofErr w:type="gramStart"/>
+      <w:r>
+        <w:t>个</w:t>
+      </w:r>
+      <w:proofErr w:type="gramEnd"/>
+      <w:r>
+        <w:t>目标去“挑选”最匹配的预测框。通过执行最优二分图匹配求解，即可得到最优的一一映射索引。</w:t>
+      </w:r>
+    </w:p>
+    <w:p>
+      <w:pPr>
+        <w:numPr>
+          <w:ilvl w:val="0"/>
+          <w:numId w:val="1"/>
+        </w:numPr>
+      </w:pPr>
+      <w:r>
+        <w:t xml:space="preserve">分类损失计算（Classification Loss） 匹配完成后，所有 100 </w:t>
+      </w:r>
+      <w:proofErr w:type="gramStart"/>
+      <w:r>
+        <w:t>个</w:t>
+      </w:r>
+      <w:proofErr w:type="gramEnd"/>
+      <w:r>
+        <w:t>预测框均需计算分类损失。分类损失采用标准的交叉</w:t>
+      </w:r>
+      <w:proofErr w:type="gramStart"/>
+      <w:r>
+        <w:t>熵</w:t>
+      </w:r>
+      <w:proofErr w:type="gramEnd"/>
+      <w:r>
+        <w:t xml:space="preserve">损失函数。 对于成功匹配到真实目标的 M </w:t>
+      </w:r>
+      <w:proofErr w:type="gramStart"/>
+      <w:r>
+        <w:t>个</w:t>
+      </w:r>
+      <w:proofErr w:type="gramEnd"/>
+      <w:r>
+        <w:t>预测框，计算其预测类别与真实类别之间的交叉</w:t>
+      </w:r>
+      <w:proofErr w:type="gramStart"/>
+      <w:r>
+        <w:t>熵</w:t>
+      </w:r>
+      <w:proofErr w:type="gramEnd"/>
+      <w:r>
+        <w:t xml:space="preserve">损失；对于未匹配到目标的其余 100-M </w:t>
+      </w:r>
+      <w:proofErr w:type="gramStart"/>
+      <w:r>
+        <w:t>个</w:t>
+      </w:r>
+      <w:proofErr w:type="gramEnd"/>
+      <w:r>
+        <w:t>预测框，其真实标签则归为空类别（背景）。由于背景框的数量通常远大于真实目标数量，为了防止类别失衡导致梯度</w:t>
+      </w:r>
+      <w:proofErr w:type="gramStart"/>
+      <w:r>
+        <w:t>被背景</w:t>
+      </w:r>
+      <w:proofErr w:type="gramEnd"/>
+      <w:r>
+        <w:t>主导，算法对背景类的损失权重进行降权（通常乘以 0.1）。</w:t>
+      </w:r>
+    </w:p>
+    <w:p>
+      <w:pPr>
+        <w:numPr>
+          <w:ilvl w:val="0"/>
+          <w:numId w:val="1"/>
+        </w:numPr>
+      </w:pPr>
+      <w:r>
+        <w:t>边界</w:t>
+      </w:r>
+      <w:proofErr w:type="gramStart"/>
+      <w:r>
+        <w:t>框定位损失</w:t>
+      </w:r>
+      <w:proofErr w:type="gramEnd"/>
+      <w:r>
+        <w:t>计算（Bounding Box Loss） 与传统基于 Anchor 的检测器不同，DETR 直接预测归一化的绝对坐标。边界</w:t>
+      </w:r>
+      <w:proofErr w:type="gramStart"/>
+      <w:r>
+        <w:t>框损失</w:t>
+      </w:r>
+      <w:proofErr w:type="gramEnd"/>
+      <w:r>
+        <w:t xml:space="preserve">仅对成功匹配到真实目标的 M </w:t>
+      </w:r>
+      <w:proofErr w:type="gramStart"/>
+      <w:r>
+        <w:t>个</w:t>
+      </w:r>
+      <w:proofErr w:type="gramEnd"/>
+      <w:r>
+        <w:t>预测</w:t>
+      </w:r>
+      <w:proofErr w:type="gramStart"/>
+      <w:r>
+        <w:t>框进行</w:t>
+      </w:r>
+      <w:proofErr w:type="gramEnd"/>
+      <w:r>
+        <w:t xml:space="preserve">计算，未匹配到目标的框不产生任何定位梯度。 定位损失由两部分加权组合而成： 第一是 L1 损失，用于计算预测框与真实框中心点及宽高坐标的绝对值误差。该损失的缺陷在于其量级受物体尺度影响较大。 第二是 </w:t>
+      </w:r>
+      <w:proofErr w:type="spellStart"/>
+      <w:r>
+        <w:t>GIoU</w:t>
+      </w:r>
+      <w:proofErr w:type="spellEnd"/>
+      <w:r>
+        <w:t xml:space="preserve"> 损失（Generalized </w:t>
+      </w:r>
+      <w:proofErr w:type="spellStart"/>
+      <w:r>
+        <w:t>IoU</w:t>
+      </w:r>
+      <w:proofErr w:type="spellEnd"/>
+      <w:r>
+        <w:t>），用于计算预测框与真实框的交并比损失。</w:t>
+      </w:r>
+      <w:proofErr w:type="spellStart"/>
+      <w:r>
+        <w:t>GIoU</w:t>
+      </w:r>
+      <w:proofErr w:type="spellEnd"/>
+      <w:r>
+        <w:t xml:space="preserve"> 具有尺度不变性，能够有效缓解 L1 损失对大目标和小目标梯度不均匀的问题。</w:t>
+      </w:r>
+    </w:p>
+    <w:p>
+      <w:pPr>
+        <w:numPr>
+          <w:ilvl w:val="0"/>
+          <w:numId w:val="1"/>
+        </w:numPr>
+      </w:pPr>
+      <w:r>
+        <w:t xml:space="preserve">辅助损失函数（Auxiliary Loss） 为了加速 Transformer Decoder 的收敛速度，DETR 在训练期间引入了辅助损失。Transformer Decoder 由 6 层级联而成。在训练过程中，不仅最后一层的输出参与计算，前 5 </w:t>
+      </w:r>
+      <w:proofErr w:type="gramStart"/>
+      <w:r>
+        <w:t>个</w:t>
+      </w:r>
+      <w:proofErr w:type="gramEnd"/>
+      <w:r>
+        <w:t>中间层的输出也会各</w:t>
+      </w:r>
+      <w:r>
+        <w:lastRenderedPageBreak/>
+        <w:t>自通过共享参数的预测头。每一层都会独立进行匈牙利匹配并计算上述的总损失，最终将 6 层的损失按同等权重相加进行反向传播。</w:t>
+      </w:r>
+    </w:p>
+    <w:p>
+      <w:r>
+        <w:t>总结：数据流转与反向传播 步骤</w:t>
+      </w:r>
+      <w:proofErr w:type="gramStart"/>
+      <w:r>
+        <w:t>一</w:t>
+      </w:r>
+      <w:proofErr w:type="gramEnd"/>
+      <w:r>
+        <w:t xml:space="preserve">：预测输出 [100, 81] 与 [100, 4] 矩阵，对接真实标签 [M, 5]。 步骤二：构建 100×100 的匹配代价矩阵。 步骤三：通过匈牙利算法求解二分图最优匹配，实现一对一连线。 步骤四：分流计算损失。M </w:t>
+      </w:r>
+      <w:proofErr w:type="gramStart"/>
+      <w:r>
+        <w:t>个</w:t>
+      </w:r>
+      <w:proofErr w:type="gramEnd"/>
+      <w:r>
+        <w:t>匹配成功的框计算“分类交叉</w:t>
+      </w:r>
+      <w:proofErr w:type="gramStart"/>
+      <w:r>
+        <w:t>熵</w:t>
+      </w:r>
+      <w:proofErr w:type="gramEnd"/>
+      <w:r>
+        <w:t xml:space="preserve">损失 + L1 定位损失 + </w:t>
+      </w:r>
+      <w:proofErr w:type="spellStart"/>
+      <w:r>
+        <w:t>GIoU</w:t>
+      </w:r>
+      <w:proofErr w:type="spellEnd"/>
+      <w:r>
+        <w:t xml:space="preserve"> 损失”；100-M </w:t>
+      </w:r>
+      <w:proofErr w:type="gramStart"/>
+      <w:r>
+        <w:t>个</w:t>
+      </w:r>
+      <w:proofErr w:type="gramEnd"/>
+      <w:r>
+        <w:t>匹配为背景</w:t>
+      </w:r>
+      <w:proofErr w:type="gramStart"/>
+      <w:r>
+        <w:t>的框仅计算</w:t>
+      </w:r>
+      <w:proofErr w:type="gramEnd"/>
+      <w:r>
+        <w:t>“背景类分类损失（降</w:t>
+      </w:r>
+      <w:proofErr w:type="gramStart"/>
+      <w:r>
+        <w:t>权</w:t>
+      </w:r>
+      <w:proofErr w:type="gramEnd"/>
+      <w:r>
+        <w:t xml:space="preserve">权重 0.1）”。 步骤五：联合 6 层 Decoder 的中间损失求和，利用 </w:t>
+      </w:r>
+      <w:proofErr w:type="spellStart"/>
+      <w:r>
+        <w:t>AdamW</w:t>
+      </w:r>
+      <w:proofErr w:type="spellEnd"/>
+      <w:r>
+        <w:t xml:space="preserve"> 优化器进行反向传播，更新全网参数。</w:t>
       </w:r>
     </w:p>
     <w:p>
@@ -361,6 +752,127 @@
     </w:p>
   </w:footnote>
 </w:footnotes>
+</file>
+
+<file path=word/numbering.xml><?xml version="1.0" encoding="utf-8"?>
+<w:numbering xmlns:wpc="http://schemas.microsoft.com/office/word/2010/wordprocessingCanvas" xmlns:cx="http://schemas.microsoft.com/office/drawing/2014/chartex" xmlns:cx1="http://schemas.microsoft.com/office/drawing/2015/9/8/chartex" xmlns:cx2="http://schemas.microsoft.com/office/drawing/2015/10/21/chartex" xmlns:cx3="http://schemas.microsoft.com/office/drawing/2016/5/9/chartex" xmlns:cx4="http://schemas.microsoft.com/office/drawing/2016/5/10/chartex" xmlns:cx5="http://schemas.microsoft.com/office/drawing/2016/5/11/chartex" xmlns:cx6="http://schemas.microsoft.com/office/drawing/2016/5/12/chartex" xmlns:cx7="http://schemas.microsoft.com/office/drawing/2016/5/13/chartex" xmlns:cx8="http://schemas.microsoft.com/office/drawing/2016/5/14/chartex" xmlns:mc="http://schemas.openxmlformats.org/markup-compatibility/2006" xmlns:aink="http://schemas.microsoft.com/office/drawing/2016/ink" xmlns:am3d="http://schemas.microsoft.com/office/drawing/2017/model3d" xmlns:o="urn:schemas-microsoft-com:office:office" xmlns:oel="http://schemas.microsoft.com/office/2019/extlst" xmlns:r="http://schemas.openxmlformats.org/officeDocument/2006/relationships" xmlns:m="http://schemas.openxmlformats.org/officeDocument/2006/math" xmlns:v="urn:schemas-microsoft-com:vml" xmlns:wp14="http://schemas.microsoft.com/office/word/2010/wordprocessingDrawing" xmlns:wp="http://schemas.openxmlformats.org/drawingml/2006/wordprocessingDrawing" xmlns:w10="urn:schemas-microsoft-com:office:word" xmlns:w="http://schemas.openxmlformats.org/wordprocessingml/2006/main" xmlns:w14="http://schemas.microsoft.com/office/word/2010/wordml" xmlns:w15="http://schemas.microsoft.com/office/word/2012/wordml" xmlns:w16cex="http://schemas.microsoft.com/office/word/2018/wordml/cex" xmlns:w16cid="http://schemas.microsoft.com/office/word/2016/wordml/cid" xmlns:w16="http://schemas.microsoft.com/office/word/2018/wordml" xmlns:w16sdtdh="http://schemas.microsoft.com/office/word/2020/wordml/sdtdatahash" xmlns:w16se="http://schemas.microsoft.com/office/word/2015/wordml/symex" xmlns:wpg="http://schemas.microsoft.com/office/word/2010/wordprocessingGroup" xmlns:wpi="http://schemas.microsoft.com/office/word/2010/wordprocessingInk" xmlns:wne="http://schemas.microsoft.com/office/word/2006/wordml" xmlns:wps="http://schemas.microsoft.com/office/word/2010/wordprocessingShape" mc:Ignorable="w14 w15 w16se w16cid w16 w16cex w16sdtdh wp14">
+  <w:abstractNum w:abstractNumId="0" w15:restartNumberingAfterBreak="0">
+    <w:nsid w:val="3D036E9C"/>
+    <w:multiLevelType w:val="multilevel"/>
+    <w:tmpl w:val="7054BAC2"/>
+    <w:lvl w:ilvl="0">
+      <w:start w:val="1"/>
+      <w:numFmt w:val="decimal"/>
+      <w:lvlText w:val="%1."/>
+      <w:lvlJc w:val="left"/>
+      <w:pPr>
+        <w:tabs>
+          <w:tab w:val="num" w:pos="720"/>
+        </w:tabs>
+        <w:ind w:left="720" w:hanging="360"/>
+      </w:pPr>
+    </w:lvl>
+    <w:lvl w:ilvl="1" w:tentative="1">
+      <w:start w:val="1"/>
+      <w:numFmt w:val="decimal"/>
+      <w:lvlText w:val="%2."/>
+      <w:lvlJc w:val="left"/>
+      <w:pPr>
+        <w:tabs>
+          <w:tab w:val="num" w:pos="1440"/>
+        </w:tabs>
+        <w:ind w:left="1440" w:hanging="360"/>
+      </w:pPr>
+    </w:lvl>
+    <w:lvl w:ilvl="2" w:tentative="1">
+      <w:start w:val="1"/>
+      <w:numFmt w:val="decimal"/>
+      <w:lvlText w:val="%3."/>
+      <w:lvlJc w:val="left"/>
+      <w:pPr>
+        <w:tabs>
+          <w:tab w:val="num" w:pos="2160"/>
+        </w:tabs>
+        <w:ind w:left="2160" w:hanging="360"/>
+      </w:pPr>
+    </w:lvl>
+    <w:lvl w:ilvl="3" w:tentative="1">
+      <w:start w:val="1"/>
+      <w:numFmt w:val="decimal"/>
+      <w:lvlText w:val="%4."/>
+      <w:lvlJc w:val="left"/>
+      <w:pPr>
+        <w:tabs>
+          <w:tab w:val="num" w:pos="2880"/>
+        </w:tabs>
+        <w:ind w:left="2880" w:hanging="360"/>
+      </w:pPr>
+    </w:lvl>
+    <w:lvl w:ilvl="4" w:tentative="1">
+      <w:start w:val="1"/>
+      <w:numFmt w:val="decimal"/>
+      <w:lvlText w:val="%5."/>
+      <w:lvlJc w:val="left"/>
+      <w:pPr>
+        <w:tabs>
+          <w:tab w:val="num" w:pos="3600"/>
+        </w:tabs>
+        <w:ind w:left="3600" w:hanging="360"/>
+      </w:pPr>
+    </w:lvl>
+    <w:lvl w:ilvl="5" w:tentative="1">
+      <w:start w:val="1"/>
+      <w:numFmt w:val="decimal"/>
+      <w:lvlText w:val="%6."/>
+      <w:lvlJc w:val="left"/>
+      <w:pPr>
+        <w:tabs>
+          <w:tab w:val="num" w:pos="4320"/>
+        </w:tabs>
+        <w:ind w:left="4320" w:hanging="360"/>
+      </w:pPr>
+    </w:lvl>
+    <w:lvl w:ilvl="6" w:tentative="1">
+      <w:start w:val="1"/>
+      <w:numFmt w:val="decimal"/>
+      <w:lvlText w:val="%7."/>
+      <w:lvlJc w:val="left"/>
+      <w:pPr>
+        <w:tabs>
+          <w:tab w:val="num" w:pos="5040"/>
+        </w:tabs>
+        <w:ind w:left="5040" w:hanging="360"/>
+      </w:pPr>
+    </w:lvl>
+    <w:lvl w:ilvl="7" w:tentative="1">
+      <w:start w:val="1"/>
+      <w:numFmt w:val="decimal"/>
+      <w:lvlText w:val="%8."/>
+      <w:lvlJc w:val="left"/>
+      <w:pPr>
+        <w:tabs>
+          <w:tab w:val="num" w:pos="5760"/>
+        </w:tabs>
+        <w:ind w:left="5760" w:hanging="360"/>
+      </w:pPr>
+    </w:lvl>
+    <w:lvl w:ilvl="8" w:tentative="1">
+      <w:start w:val="1"/>
+      <w:numFmt w:val="decimal"/>
+      <w:lvlText w:val="%9."/>
+      <w:lvlJc w:val="left"/>
+      <w:pPr>
+        <w:tabs>
+          <w:tab w:val="num" w:pos="6480"/>
+        </w:tabs>
+        <w:ind w:left="6480" w:hanging="360"/>
+      </w:pPr>
+    </w:lvl>
+  </w:abstractNum>
+  <w:num w:numId="1" w16cid:durableId="630132156">
+    <w:abstractNumId w:val="0"/>
+  </w:num>
+</w:numbering>
 </file>
 
 <file path=word/styles.xml><?xml version="1.0" encoding="utf-8"?>

</xml_diff>